<commit_message>
Golden renders refreshed after the three fixes
Rebuilt the five reference decks with aa30cf4 and re-exported every slide
(now 102: Reference B gains a three-cell and a four-cell formula triangle).
The first set stays in history at e0d5210 for before-and-after comparison.

design-inventory.md and render-constraints.md now describe the fixed
behaviour, and list two issues seen in the renders but left alone: a long
mark scheme can overflow its panel, and "kg/m^3" prints raw in GUESS rows.
CHANGELOG.md records the session.

Co-Authored-By: Claude Opus 5.5 <noreply@anthropic.com>
</commit_message>
<xml_diff>
--- a/science-lesson-v4/golden/build/Reference-B-Build-Types_support_worksheet.docx
+++ b/science-lesson-v4/golden/build/Reference-B-Build-Types_support_worksheet.docx
@@ -1891,7 +1891,31 @@
     </w:p>
     <w:p>
       <w:pPr>
-        <w:spacing w:after="20" w:before="20"/>
+        <w:spacing w:after="10" w:before="10"/>
+        <w:ind w:left="360"/>
+      </w:pPr>
+      <w:r>
+        <w:rPr>
+          <w:i/>
+          <w:iCs/>
+          <w:color w:val="0D1B5E"/>
+          <w:sz w:val="22"/>
+          <w:szCs w:val="22"/>
+        </w:rPr>
+        <w:t xml:space="preserve">Use: </w:t>
+      </w:r>
+      <w:r>
+        <w:rPr>
+          <w:color w:val="0D1B5E"/>
+          <w:sz w:val="22"/>
+          <w:szCs w:val="22"/>
+        </w:rPr>
+        <w:t xml:space="preserve">Δ E = mcΔθ</w:t>
+      </w:r>
+    </w:p>
+    <w:p>
+      <w:pPr>
+        <w:spacing w:after="0" w:before="20"/>
       </w:pPr>
       <w:r>
         <w:rPr>
@@ -1907,116 +1931,7 @@
           <w:sz w:val="24"/>
           <w:szCs w:val="24"/>
         </w:rPr>
-        <w:t xml:space="preserve">Spot the mistake in this working, then write the corrected line:</w:t>
-      </w:r>
-    </w:p>
-    <w:p>
-      <w:pPr>
-        <w:spacing w:after="20" w:before="20"/>
-        <w:ind w:left="360"/>
-      </w:pPr>
-      <w:r>
-        <w:rPr>
-          <w:b/>
-          <w:bCs/>
-          <w:sz w:val="20"/>
-          <w:szCs w:val="20"/>
-        </w:rPr>
-        <w:t xml:space="preserve">1   </w:t>
-      </w:r>
-      <w:r>
-        <w:rPr>
-          <w:sz w:val="20"/>
-          <w:szCs w:val="20"/>
-        </w:rPr>
-        <w:t xml:space="preserve">rate = time \div volume</w:t>
-      </w:r>
-    </w:p>
-    <w:p>
-      <w:pPr>
-        <w:spacing w:after="20" w:before="20"/>
-        <w:ind w:left="360"/>
-      </w:pPr>
-      <w:r>
-        <w:rPr>
-          <w:b/>
-          <w:bCs/>
-          <w:sz w:val="20"/>
-          <w:szCs w:val="20"/>
-        </w:rPr>
-        <w:t xml:space="preserve">2   </w:t>
-      </w:r>
-      <w:r>
-        <w:rPr>
-          <w:sz w:val="20"/>
-          <w:szCs w:val="20"/>
-        </w:rPr>
-        <w:t xml:space="preserve">rate = 40 \div 60</w:t>
-      </w:r>
-    </w:p>
-    <w:p>
-      <w:pPr>
-        <w:spacing w:after="20" w:before="20"/>
-        <w:ind w:left="360"/>
-      </w:pPr>
-      <w:r>
-        <w:rPr>
-          <w:b/>
-          <w:bCs/>
-          <w:sz w:val="20"/>
-          <w:szCs w:val="20"/>
-        </w:rPr>
-        <w:t xml:space="preserve">3   </w:t>
-      </w:r>
-      <w:r>
-        <w:rPr>
-          <w:sz w:val="20"/>
-          <w:szCs w:val="20"/>
-        </w:rPr>
-        <w:t xml:space="preserve">rate = 0.67</w:t>
-      </w:r>
-    </w:p>
-    <w:p>
-      <w:pPr>
-        <w:spacing w:after="20" w:before="20"/>
-        <w:ind w:left="360"/>
-      </w:pPr>
-      <w:r>
-        <w:rPr>
-          <w:b/>
-          <w:bCs/>
-          <w:sz w:val="20"/>
-          <w:szCs w:val="20"/>
-        </w:rPr>
-        <w:t xml:space="preserve">4   </w:t>
-      </w:r>
-      <w:r>
-        <w:rPr>
-          <w:sz w:val="20"/>
-          <w:szCs w:val="20"/>
-        </w:rPr>
-        <w:t xml:space="preserve">rate = 0.67 cm^3/s</w:t>
-      </w:r>
-    </w:p>
-    <w:p>
-      <w:pPr>
-        <w:spacing w:after="0" w:before="20"/>
-      </w:pPr>
-      <w:r>
-        <w:rPr>
-          <w:b/>
-          <w:bCs/>
-          <w:sz w:val="24"/>
-          <w:szCs w:val="24"/>
-        </w:rPr>
-        <w:t xml:space="preserve">Q11  </w:t>
-      </w:r>
-      <w:r>
-        <w:rPr>
-          <w:sz w:val="24"/>
-          <w:szCs w:val="24"/>
-        </w:rPr>
-        <w:t xml:space="preserve">Where is the reaction fastest?</w:t>
+        <w:t xml:space="preserve">Heat 2 kg of water by 10°C. c = 4200 J/kg°C. Find Δ E.</w:t>
       </w:r>
     </w:p>
     <w:p>
@@ -2030,7 +1945,7 @@
           <w:sz w:val="20"/>
           <w:szCs w:val="20"/>
         </w:rPr>
-        <w:t xml:space="preserve">[1 mark]</w:t>
+        <w:t xml:space="preserve">[2 marks]</w:t>
       </w:r>
     </w:p>
     <w:p>
@@ -2044,14 +1959,14 @@
           <w:sz w:val="24"/>
           <w:szCs w:val="24"/>
         </w:rPr>
-        <w:t xml:space="preserve">Q12  </w:t>
-      </w:r>
-      <w:r>
-        <w:rPr>
-          <w:sz w:val="24"/>
-          <w:szCs w:val="24"/>
-        </w:rPr>
-        <w:t xml:space="preserve">What does the flat section show?</w:t>
+        <w:t xml:space="preserve">Q11  </w:t>
+      </w:r>
+      <w:r>
+        <w:rPr>
+          <w:sz w:val="24"/>
+          <w:szCs w:val="24"/>
+        </w:rPr>
+        <w:t xml:space="preserve">50000 J heats 5 kg of oil by 5°C. Find c.</w:t>
       </w:r>
     </w:p>
     <w:p>
@@ -2065,7 +1980,7 @@
           <w:sz w:val="20"/>
           <w:szCs w:val="20"/>
         </w:rPr>
-        <w:t xml:space="preserve">[2 marks]</w:t>
+        <w:t xml:space="preserve">[3 marks]</w:t>
       </w:r>
     </w:p>
     <w:p>
@@ -2079,14 +1994,14 @@
           <w:sz w:val="24"/>
           <w:szCs w:val="24"/>
         </w:rPr>
-        <w:t xml:space="preserve">Q13  </w:t>
-      </w:r>
-      <w:r>
-        <w:rPr>
-          <w:sz w:val="24"/>
-          <w:szCs w:val="24"/>
-        </w:rPr>
-        <w:t xml:space="preserve">How would a powder change the curve?</w:t>
+        <w:t xml:space="preserve">Q12  </w:t>
+      </w:r>
+      <w:r>
+        <w:rPr>
+          <w:sz w:val="24"/>
+          <w:szCs w:val="24"/>
+        </w:rPr>
+        <w:t xml:space="preserve">12600 J heats 0.5 kg of water. c = 4200 J/kg°C. Find Δθ.</w:t>
       </w:r>
     </w:p>
     <w:p>
@@ -2100,21 +2015,235 @@
           <w:sz w:val="20"/>
           <w:szCs w:val="20"/>
         </w:rPr>
+        <w:t xml:space="preserve">[3 marks]</w:t>
+      </w:r>
+    </w:p>
+    <w:p>
+      <w:pPr>
+        <w:spacing w:after="20" w:before="20"/>
+      </w:pPr>
+      <w:r>
+        <w:rPr>
+          <w:b/>
+          <w:bCs/>
+          <w:sz w:val="24"/>
+          <w:szCs w:val="24"/>
+        </w:rPr>
+        <w:t xml:space="preserve">Q13  </w:t>
+      </w:r>
+      <w:r>
+        <w:rPr>
+          <w:sz w:val="24"/>
+          <w:szCs w:val="24"/>
+        </w:rPr>
+        <w:t xml:space="preserve">Spot the mistake in this working, then write the corrected line:</w:t>
+      </w:r>
+    </w:p>
+    <w:p>
+      <w:pPr>
+        <w:spacing w:after="20" w:before="20"/>
+        <w:ind w:left="360"/>
+      </w:pPr>
+      <w:r>
+        <w:rPr>
+          <w:b/>
+          <w:bCs/>
+          <w:sz w:val="20"/>
+          <w:szCs w:val="20"/>
+        </w:rPr>
+        <w:t xml:space="preserve">1   </w:t>
+      </w:r>
+      <w:r>
+        <w:rPr>
+          <w:sz w:val="20"/>
+          <w:szCs w:val="20"/>
+        </w:rPr>
+        <w:t xml:space="preserve">rate = time \div volume</w:t>
+      </w:r>
+    </w:p>
+    <w:p>
+      <w:pPr>
+        <w:spacing w:after="20" w:before="20"/>
+        <w:ind w:left="360"/>
+      </w:pPr>
+      <w:r>
+        <w:rPr>
+          <w:b/>
+          <w:bCs/>
+          <w:sz w:val="20"/>
+          <w:szCs w:val="20"/>
+        </w:rPr>
+        <w:t xml:space="preserve">2   </w:t>
+      </w:r>
+      <w:r>
+        <w:rPr>
+          <w:sz w:val="20"/>
+          <w:szCs w:val="20"/>
+        </w:rPr>
+        <w:t xml:space="preserve">rate = 40 \div 60</w:t>
+      </w:r>
+    </w:p>
+    <w:p>
+      <w:pPr>
+        <w:spacing w:after="20" w:before="20"/>
+        <w:ind w:left="360"/>
+      </w:pPr>
+      <w:r>
+        <w:rPr>
+          <w:b/>
+          <w:bCs/>
+          <w:sz w:val="20"/>
+          <w:szCs w:val="20"/>
+        </w:rPr>
+        <w:t xml:space="preserve">3   </w:t>
+      </w:r>
+      <w:r>
+        <w:rPr>
+          <w:sz w:val="20"/>
+          <w:szCs w:val="20"/>
+        </w:rPr>
+        <w:t xml:space="preserve">rate = 0.67</w:t>
+      </w:r>
+    </w:p>
+    <w:p>
+      <w:pPr>
+        <w:spacing w:after="20" w:before="20"/>
+        <w:ind w:left="360"/>
+      </w:pPr>
+      <w:r>
+        <w:rPr>
+          <w:b/>
+          <w:bCs/>
+          <w:sz w:val="20"/>
+          <w:szCs w:val="20"/>
+        </w:rPr>
+        <w:t xml:space="preserve">4   </w:t>
+      </w:r>
+      <w:r>
+        <w:rPr>
+          <w:sz w:val="20"/>
+          <w:szCs w:val="20"/>
+        </w:rPr>
+        <w:t xml:space="preserve">rate = 0.67 cm^3/s</w:t>
+      </w:r>
+    </w:p>
+    <w:p>
+      <w:pPr>
+        <w:spacing w:after="0" w:before="20"/>
+      </w:pPr>
+      <w:r>
+        <w:rPr>
+          <w:b/>
+          <w:bCs/>
+          <w:sz w:val="24"/>
+          <w:szCs w:val="24"/>
+        </w:rPr>
+        <w:t xml:space="preserve">Q14  </w:t>
+      </w:r>
+      <w:r>
+        <w:rPr>
+          <w:sz w:val="24"/>
+          <w:szCs w:val="24"/>
+        </w:rPr>
+        <w:t xml:space="preserve">Where is the reaction fastest?</w:t>
+      </w:r>
+    </w:p>
+    <w:p>
+      <w:pPr>
+        <w:spacing w:after="20" w:before="0"/>
+        <w:jc w:val="right"/>
+      </w:pPr>
+      <w:r>
+        <w:rPr>
+          <w:color w:val="888888"/>
+          <w:sz w:val="20"/>
+          <w:szCs w:val="20"/>
+        </w:rPr>
+        <w:t xml:space="preserve">[1 mark]</w:t>
+      </w:r>
+    </w:p>
+    <w:p>
+      <w:pPr>
+        <w:spacing w:after="0" w:before="20"/>
+      </w:pPr>
+      <w:r>
+        <w:rPr>
+          <w:b/>
+          <w:bCs/>
+          <w:sz w:val="24"/>
+          <w:szCs w:val="24"/>
+        </w:rPr>
+        <w:t xml:space="preserve">Q15  </w:t>
+      </w:r>
+      <w:r>
+        <w:rPr>
+          <w:sz w:val="24"/>
+          <w:szCs w:val="24"/>
+        </w:rPr>
+        <w:t xml:space="preserve">What does the flat section show?</w:t>
+      </w:r>
+    </w:p>
+    <w:p>
+      <w:pPr>
+        <w:spacing w:after="20" w:before="0"/>
+        <w:jc w:val="right"/>
+      </w:pPr>
+      <w:r>
+        <w:rPr>
+          <w:color w:val="888888"/>
+          <w:sz w:val="20"/>
+          <w:szCs w:val="20"/>
+        </w:rPr>
         <w:t xml:space="preserve">[2 marks]</w:t>
       </w:r>
     </w:p>
     <w:p>
       <w:pPr>
-        <w:spacing w:after="20" w:before="20"/>
-      </w:pPr>
-      <w:r>
-        <w:rPr>
-          <w:b/>
-          <w:bCs/>
-          <w:sz w:val="24"/>
-          <w:szCs w:val="24"/>
-        </w:rPr>
-        <w:t xml:space="preserve">Q14  </w:t>
+        <w:spacing w:after="0" w:before="20"/>
+      </w:pPr>
+      <w:r>
+        <w:rPr>
+          <w:b/>
+          <w:bCs/>
+          <w:sz w:val="24"/>
+          <w:szCs w:val="24"/>
+        </w:rPr>
+        <w:t xml:space="preserve">Q16  </w:t>
+      </w:r>
+      <w:r>
+        <w:rPr>
+          <w:sz w:val="24"/>
+          <w:szCs w:val="24"/>
+        </w:rPr>
+        <w:t xml:space="preserve">How would a powder change the curve?</w:t>
+      </w:r>
+    </w:p>
+    <w:p>
+      <w:pPr>
+        <w:spacing w:after="20" w:before="0"/>
+        <w:jc w:val="right"/>
+      </w:pPr>
+      <w:r>
+        <w:rPr>
+          <w:color w:val="888888"/>
+          <w:sz w:val="20"/>
+          <w:szCs w:val="20"/>
+        </w:rPr>
+        <w:t xml:space="preserve">[2 marks]</w:t>
+      </w:r>
+    </w:p>
+    <w:p>
+      <w:pPr>
+        <w:spacing w:after="20" w:before="20"/>
+      </w:pPr>
+      <w:r>
+        <w:rPr>
+          <w:b/>
+          <w:bCs/>
+          <w:sz w:val="24"/>
+          <w:szCs w:val="24"/>
+        </w:rPr>
+        <w:t xml:space="preserve">Q17  </w:t>
       </w:r>
       <w:r>
         <w:rPr>

</xml_diff>